<commit_message>
Reorganizar estructura inicial del repositorio
</commit_message>
<xml_diff>
--- a/docs/Protocolo de conocimiento v1.docx
+++ b/docs/Protocolo de conocimiento v1.docx
@@ -1,6 +1,6 @@
 
 <file path=word/document.xml><?xml version="1.0" encoding="utf-8"?>
-<w:document xmlns:wpc="http://schemas.microsoft.com/office/word/2010/wordprocessingCanvas" xmlns:cx="http://schemas.microsoft.com/office/drawing/2014/chartex" xmlns:cx1="http://schemas.microsoft.com/office/drawing/2015/9/8/chartex" xmlns:cx2="http://schemas.microsoft.com/office/drawing/2015/10/21/chartex" xmlns:cx3="http://schemas.microsoft.com/office/drawing/2016/5/9/chartex" xmlns:cx4="http://schemas.microsoft.com/office/drawing/2016/5/10/chartex" xmlns:cx5="http://schemas.microsoft.com/office/drawing/2016/5/11/chartex" xmlns:cx6="http://schemas.microsoft.com/office/drawing/2016/5/12/chartex" xmlns:cx7="http://schemas.microsoft.com/office/drawing/2016/5/13/chartex" xmlns:cx8="http://schemas.microsoft.com/office/drawing/2016/5/14/chartex" xmlns:mc="http://schemas.openxmlformats.org/markup-compatibility/2006" xmlns:aink="http://schemas.microsoft.com/office/drawing/2016/ink" xmlns:am3d="http://schemas.microsoft.com/office/drawing/2017/model3d" xmlns:o="urn:schemas-microsoft-com:office:office" xmlns:r="http://schemas.openxmlformats.org/officeDocument/2006/relationships" xmlns:m="http://schemas.openxmlformats.org/officeDocument/2006/math" xmlns:v="urn:schemas-microsoft-com:vml" xmlns:wp14="http://schemas.microsoft.com/office/word/2010/wordprocessingDrawing" xmlns:wp="http://schemas.openxmlformats.org/drawingml/2006/wordprocessingDrawing" xmlns:w10="urn:schemas-microsoft-com:office:word" xmlns:w="http://schemas.openxmlformats.org/wordprocessingml/2006/main" xmlns:w14="http://schemas.microsoft.com/office/word/2010/wordml" xmlns:w15="http://schemas.microsoft.com/office/word/2012/wordml" xmlns:w16cex="http://schemas.microsoft.com/office/word/2018/wordml/cex" xmlns:w16cid="http://schemas.microsoft.com/office/word/2016/wordml/cid" xmlns:w16="http://schemas.microsoft.com/office/word/2018/wordml" xmlns:w16sdtdh="http://schemas.microsoft.com/office/word/2020/wordml/sdtdatahash" xmlns:w16se="http://schemas.microsoft.com/office/word/2015/wordml/symex" xmlns:wpg="http://schemas.microsoft.com/office/word/2010/wordprocessingGroup" xmlns:wpi="http://schemas.microsoft.com/office/word/2010/wordprocessingInk" xmlns:wne="http://schemas.microsoft.com/office/word/2006/wordml" xmlns:wps="http://schemas.microsoft.com/office/word/2010/wordprocessingShape" mc:Ignorable="w14 w15 w16se w16cid w16 w16cex w16sdtdh wp14">
+<w:document xmlns:wpc="http://schemas.microsoft.com/office/word/2010/wordprocessingCanvas" xmlns:cx="http://schemas.microsoft.com/office/drawing/2014/chartex" xmlns:cx1="http://schemas.microsoft.com/office/drawing/2015/9/8/chartex" xmlns:cx2="http://schemas.microsoft.com/office/drawing/2015/10/21/chartex" xmlns:cx3="http://schemas.microsoft.com/office/drawing/2016/5/9/chartex" xmlns:cx4="http://schemas.microsoft.com/office/drawing/2016/5/10/chartex" xmlns:cx5="http://schemas.microsoft.com/office/drawing/2016/5/11/chartex" xmlns:cx6="http://schemas.microsoft.com/office/drawing/2016/5/12/chartex" xmlns:cx7="http://schemas.microsoft.com/office/drawing/2016/5/13/chartex" xmlns:cx8="http://schemas.microsoft.com/office/drawing/2016/5/14/chartex" xmlns:mc="http://schemas.openxmlformats.org/markup-compatibility/2006" xmlns:aink="http://schemas.microsoft.com/office/drawing/2016/ink" xmlns:am3d="http://schemas.microsoft.com/office/drawing/2017/model3d" xmlns:o="urn:schemas-microsoft-com:office:office" xmlns:oel="http://schemas.microsoft.com/office/2019/extlst" xmlns:r="http://schemas.openxmlformats.org/officeDocument/2006/relationships" xmlns:m="http://schemas.openxmlformats.org/officeDocument/2006/math" xmlns:v="urn:schemas-microsoft-com:vml" xmlns:wp14="http://schemas.microsoft.com/office/word/2010/wordprocessingDrawing" xmlns:wp="http://schemas.openxmlformats.org/drawingml/2006/wordprocessingDrawing" xmlns:w10="urn:schemas-microsoft-com:office:word" xmlns:w="http://schemas.openxmlformats.org/wordprocessingml/2006/main" xmlns:w14="http://schemas.microsoft.com/office/word/2010/wordml" xmlns:w15="http://schemas.microsoft.com/office/word/2012/wordml" xmlns:w16cex="http://schemas.microsoft.com/office/word/2018/wordml/cex" xmlns:w16cid="http://schemas.microsoft.com/office/word/2016/wordml/cid" xmlns:w16="http://schemas.microsoft.com/office/word/2018/wordml" xmlns:w16du="http://schemas.microsoft.com/office/word/2023/wordml/word16du" xmlns:w16sdtdh="http://schemas.microsoft.com/office/word/2020/wordml/sdtdatahash" xmlns:w16se="http://schemas.microsoft.com/office/word/2015/wordml/symex" xmlns:wpg="http://schemas.microsoft.com/office/word/2010/wordprocessingGroup" xmlns:wpi="http://schemas.microsoft.com/office/word/2010/wordprocessingInk" xmlns:wne="http://schemas.microsoft.com/office/word/2006/wordml" xmlns:wps="http://schemas.microsoft.com/office/word/2010/wordprocessingShape" mc:Ignorable="w14 w15 w16se w16cid w16 w16cex w16sdtdh w16du wp14">
   <w:body>
     <w:p>
       <w:pPr>
@@ -6262,6 +6262,1024 @@
         <w:t>, donde cada concepto crece, se relaciona, se valida y evoluciona con el tiempo. Si logramos construir eso, habremos creado un activo que ODU podrá aprovechar durante muchos años y que incluso podrá enriquecerse con el conocimiento de otros entrenadores sin perder la identidad de cada escuela de entrenamiento.</w:t>
       </w:r>
     </w:p>
+    <w:p>
+      <w:r>
+        <w:t xml:space="preserve">OTRO </w:t>
+      </w:r>
+      <w:proofErr w:type="spellStart"/>
+      <w:r>
+        <w:t>dia</w:t>
+      </w:r>
+      <w:proofErr w:type="spellEnd"/>
+      <w:r>
+        <w:t xml:space="preserve"> dijo </w:t>
+      </w:r>
+      <w:proofErr w:type="gramStart"/>
+      <w:r>
+        <w:t>esto :</w:t>
+      </w:r>
+      <w:proofErr w:type="gramEnd"/>
+      <w:r>
+        <w:t xml:space="preserve"> </w:t>
+      </w:r>
+    </w:p>
+    <w:p>
+      <w:r>
+        <w:t xml:space="preserve">Sí: </w:t>
+      </w:r>
+      <w:r>
+        <w:rPr>
+          <w:b/>
+          <w:bCs/>
+        </w:rPr>
+        <w:t xml:space="preserve">para </w:t>
+      </w:r>
+      <w:proofErr w:type="spellStart"/>
+      <w:r>
+        <w:rPr>
+          <w:b/>
+          <w:bCs/>
+        </w:rPr>
+        <w:t>BeachLab</w:t>
+      </w:r>
+      <w:proofErr w:type="spellEnd"/>
+      <w:r>
+        <w:rPr>
+          <w:b/>
+          <w:bCs/>
+        </w:rPr>
+        <w:t xml:space="preserve"> no conviene confiar en que yo “recuerde” esos audios dentro de un mes</w:t>
+      </w:r>
+      <w:r>
+        <w:t>.</w:t>
+      </w:r>
+    </w:p>
+    <w:p>
+      <w:r>
+        <w:t xml:space="preserve">En este momento no tengo recuperado ningún contenido concreto de esos audios como conocimiento estructurado. Puede que hayan quedado asociados al chat donde los enviaste, pero eso no equivale a que sus conceptos hayan quedado incorporados de forma estable y reutilizable. </w:t>
+      </w:r>
+      <w:proofErr w:type="spellStart"/>
+      <w:r>
+        <w:t>ChatGPT</w:t>
+      </w:r>
+      <w:proofErr w:type="spellEnd"/>
+      <w:r>
+        <w:t xml:space="preserve"> puede usar historial y memoria para dar continuidad, pero no recuerda </w:t>
+      </w:r>
+      <w:r>
+        <w:lastRenderedPageBreak/>
+        <w:t xml:space="preserve">necesariamente cada detalle de conversaciones anteriores; </w:t>
+      </w:r>
+      <w:proofErr w:type="spellStart"/>
+      <w:r>
+        <w:t>OpenAI</w:t>
+      </w:r>
+      <w:proofErr w:type="spellEnd"/>
+      <w:r>
+        <w:t xml:space="preserve"> recomienda usar memorias guardadas para datos que </w:t>
+      </w:r>
+      <w:proofErr w:type="spellStart"/>
+      <w:r>
+        <w:t>querés</w:t>
+      </w:r>
+      <w:proofErr w:type="spellEnd"/>
+      <w:r>
+        <w:t xml:space="preserve"> conservar, y aun así una memoria no es el lugar adecuado para guardar conocimiento técnico extenso. (</w:t>
+      </w:r>
+      <w:proofErr w:type="spellStart"/>
+      <w:r>
+        <w:fldChar w:fldCharType="begin"/>
+      </w:r>
+      <w:r>
+        <w:instrText>HYPERLINK "https://help.openai.com/articles/8590148-memory-faq?utm_source=chatgpt.com" \o "Memory FAQ"</w:instrText>
+      </w:r>
+      <w:r>
+        <w:fldChar w:fldCharType="separate"/>
+      </w:r>
+      <w:r>
+        <w:rPr>
+          <w:rStyle w:val="Hipervnculo"/>
+        </w:rPr>
+        <w:t>OpenAI</w:t>
+      </w:r>
+      <w:proofErr w:type="spellEnd"/>
+      <w:r>
+        <w:rPr>
+          <w:rStyle w:val="Hipervnculo"/>
+        </w:rPr>
+        <w:t xml:space="preserve"> </w:t>
+      </w:r>
+      <w:proofErr w:type="spellStart"/>
+      <w:r>
+        <w:rPr>
+          <w:rStyle w:val="Hipervnculo"/>
+        </w:rPr>
+        <w:t>Help</w:t>
+      </w:r>
+      <w:proofErr w:type="spellEnd"/>
+      <w:r>
+        <w:rPr>
+          <w:rStyle w:val="Hipervnculo"/>
+        </w:rPr>
+        <w:t xml:space="preserve"> Center</w:t>
+      </w:r>
+      <w:r>
+        <w:fldChar w:fldCharType="end"/>
+      </w:r>
+      <w:r>
+        <w:t>)</w:t>
+      </w:r>
+    </w:p>
+    <w:p>
+      <w:r>
+        <w:t xml:space="preserve">Los audios o archivos enviados quedan vinculados al chat correspondiente según sus reglas de conservación. El contenido extraído puede seguir accesible dentro de esa conversación, mientras exista, pero no debemos tratarlo como una biblioteca permanente de </w:t>
+      </w:r>
+      <w:proofErr w:type="spellStart"/>
+      <w:r>
+        <w:t>BeachLab</w:t>
+      </w:r>
+      <w:proofErr w:type="spellEnd"/>
+      <w:r>
+        <w:t>. (</w:t>
+      </w:r>
+      <w:proofErr w:type="spellStart"/>
+      <w:r>
+        <w:fldChar w:fldCharType="begin"/>
+      </w:r>
+      <w:r>
+        <w:instrText>HYPERLINK "https://help.openai.com/en/articles/8555545-file-uploads-faq?utm_source=chatgpt.com" \o "File Uploads FAQ"</w:instrText>
+      </w:r>
+      <w:r>
+        <w:fldChar w:fldCharType="separate"/>
+      </w:r>
+      <w:r>
+        <w:rPr>
+          <w:rStyle w:val="Hipervnculo"/>
+        </w:rPr>
+        <w:t>OpenAI</w:t>
+      </w:r>
+      <w:proofErr w:type="spellEnd"/>
+      <w:r>
+        <w:rPr>
+          <w:rStyle w:val="Hipervnculo"/>
+        </w:rPr>
+        <w:t xml:space="preserve"> </w:t>
+      </w:r>
+      <w:proofErr w:type="spellStart"/>
+      <w:r>
+        <w:rPr>
+          <w:rStyle w:val="Hipervnculo"/>
+        </w:rPr>
+        <w:t>Help</w:t>
+      </w:r>
+      <w:proofErr w:type="spellEnd"/>
+      <w:r>
+        <w:rPr>
+          <w:rStyle w:val="Hipervnculo"/>
+        </w:rPr>
+        <w:t xml:space="preserve"> Center</w:t>
+      </w:r>
+      <w:r>
+        <w:fldChar w:fldCharType="end"/>
+      </w:r>
+      <w:r>
+        <w:t>)</w:t>
+      </w:r>
+    </w:p>
+    <w:p>
+      <w:pPr>
+        <w:rPr>
+          <w:b/>
+          <w:bCs/>
+        </w:rPr>
+      </w:pPr>
+      <w:r>
+        <w:rPr>
+          <w:b/>
+          <w:bCs/>
+        </w:rPr>
+        <w:t>Qué debería hacer el Editor de Conocimiento</w:t>
+      </w:r>
+    </w:p>
+    <w:p>
+      <w:r>
+        <w:t>El flujo correcto sería:</w:t>
+      </w:r>
+    </w:p>
+    <w:p>
+      <w:r>
+        <w:t>Audio original</w:t>
+      </w:r>
+    </w:p>
+    <w:p>
+      <w:r>
+        <w:t xml:space="preserve">      ↓</w:t>
+      </w:r>
+    </w:p>
+    <w:p>
+      <w:r>
+        <w:t>Transcripción completa</w:t>
+      </w:r>
+    </w:p>
+    <w:p>
+      <w:r>
+        <w:t xml:space="preserve">      ↓</w:t>
+      </w:r>
+    </w:p>
+    <w:p>
+      <w:r>
+        <w:t>Análisis y separación de conceptos</w:t>
+      </w:r>
+    </w:p>
+    <w:p>
+      <w:r>
+        <w:t xml:space="preserve">      ↓</w:t>
+      </w:r>
+    </w:p>
+    <w:p>
+      <w:r>
+        <w:t>Fichas de conocimiento</w:t>
+      </w:r>
+    </w:p>
+    <w:p>
+      <w:r>
+        <w:t xml:space="preserve">      ↓</w:t>
+      </w:r>
+    </w:p>
+    <w:p>
+      <w:r>
+        <w:t>Revisión humana</w:t>
+      </w:r>
+    </w:p>
+    <w:p>
+      <w:r>
+        <w:t xml:space="preserve">      ↓</w:t>
+      </w:r>
+    </w:p>
+    <w:p>
+      <w:r>
+        <w:t xml:space="preserve">Archivos guardados en </w:t>
+      </w:r>
+      <w:proofErr w:type="spellStart"/>
+      <w:r>
+        <w:t>BeachLab</w:t>
+      </w:r>
+      <w:proofErr w:type="spellEnd"/>
+    </w:p>
+    <w:p>
+      <w:r>
+        <w:t xml:space="preserve">Por ejemplo, vos </w:t>
+      </w:r>
+      <w:proofErr w:type="spellStart"/>
+      <w:r>
+        <w:t>grabás</w:t>
+      </w:r>
+      <w:proofErr w:type="spellEnd"/>
+      <w:r>
+        <w:t xml:space="preserve"> un audio de quince minutos diciendo cosas mezcladas:</w:t>
+      </w:r>
+    </w:p>
+    <w:p>
+      <w:r>
+        <w:t>“Cuando el bloqueo rival cierra línea, la defensora debería anticipar diagonal… esto depende también del viento… y hay jugadoras que retroceden demasiado pronto…”</w:t>
+      </w:r>
+    </w:p>
+    <w:p>
+      <w:r>
+        <w:t>El Editor:</w:t>
+      </w:r>
+    </w:p>
+    <w:p>
+      <w:pPr>
+        <w:numPr>
+          <w:ilvl w:val="0"/>
+          <w:numId w:val="3"/>
+        </w:numPr>
+      </w:pPr>
+      <w:r>
+        <w:t>Guarda el audio original.</w:t>
+      </w:r>
+    </w:p>
+    <w:p>
+      <w:pPr>
+        <w:numPr>
+          <w:ilvl w:val="0"/>
+          <w:numId w:val="3"/>
+        </w:numPr>
+      </w:pPr>
+      <w:r>
+        <w:t>Lo transcribe.</w:t>
+      </w:r>
+    </w:p>
+    <w:p>
+      <w:pPr>
+        <w:numPr>
+          <w:ilvl w:val="0"/>
+          <w:numId w:val="3"/>
+        </w:numPr>
+      </w:pPr>
+      <w:r>
+        <w:t>Detecta que ahí hay varios conocimientos diferentes.</w:t>
+      </w:r>
+    </w:p>
+    <w:p>
+      <w:pPr>
+        <w:numPr>
+          <w:ilvl w:val="0"/>
+          <w:numId w:val="3"/>
+        </w:numPr>
+      </w:pPr>
+      <w:r>
+        <w:t>Propone fichas separadas, por ejemplo:</w:t>
+      </w:r>
+    </w:p>
+    <w:p>
+      <w:pPr>
+        <w:numPr>
+          <w:ilvl w:val="1"/>
+          <w:numId w:val="3"/>
+        </w:numPr>
+      </w:pPr>
+      <w:r>
+        <w:t>Defensa de diagonal ante bloqueo de línea.</w:t>
+      </w:r>
+    </w:p>
+    <w:p>
+      <w:pPr>
+        <w:numPr>
+          <w:ilvl w:val="1"/>
+          <w:numId w:val="3"/>
+        </w:numPr>
+      </w:pPr>
+      <w:r>
+        <w:t>Influencia del viento en la posición defensiva.</w:t>
+      </w:r>
+    </w:p>
+    <w:p>
+      <w:pPr>
+        <w:numPr>
+          <w:ilvl w:val="1"/>
+          <w:numId w:val="3"/>
+        </w:numPr>
+      </w:pPr>
+      <w:r>
+        <w:t>Error técnico: retroceder antes del contacto rival.</w:t>
+      </w:r>
+    </w:p>
+    <w:p>
+      <w:pPr>
+        <w:numPr>
+          <w:ilvl w:val="0"/>
+          <w:numId w:val="3"/>
+        </w:numPr>
+      </w:pPr>
+      <w:r>
+        <w:t xml:space="preserve">Vos corregís o </w:t>
+      </w:r>
+      <w:proofErr w:type="spellStart"/>
+      <w:r>
+        <w:t>aprobás</w:t>
+      </w:r>
+      <w:proofErr w:type="spellEnd"/>
+      <w:r>
+        <w:t>.</w:t>
+      </w:r>
+    </w:p>
+    <w:p>
+      <w:pPr>
+        <w:numPr>
+          <w:ilvl w:val="0"/>
+          <w:numId w:val="3"/>
+        </w:numPr>
+      </w:pPr>
+      <w:r>
+        <w:t>El sistema guarda cada ficha en .</w:t>
+      </w:r>
+      <w:proofErr w:type="spellStart"/>
+      <w:r>
+        <w:t>md</w:t>
+      </w:r>
+      <w:proofErr w:type="spellEnd"/>
+      <w:r>
+        <w:t>.</w:t>
+      </w:r>
+    </w:p>
+    <w:p>
+      <w:pPr>
+        <w:rPr>
+          <w:b/>
+          <w:bCs/>
+        </w:rPr>
+      </w:pPr>
+      <w:r>
+        <w:rPr>
+          <w:b/>
+          <w:bCs/>
+        </w:rPr>
+        <w:lastRenderedPageBreak/>
+        <w:t>Ejemplo de una ficha</w:t>
+      </w:r>
+    </w:p>
+    <w:p>
+      <w:r>
+        <w:t>---</w:t>
+      </w:r>
+    </w:p>
+    <w:p>
+      <w:r>
+        <w:t>id: TACT-DEF-0001</w:t>
+      </w:r>
+    </w:p>
+    <w:p>
+      <w:proofErr w:type="spellStart"/>
+      <w:r>
+        <w:t>titulo</w:t>
+      </w:r>
+      <w:proofErr w:type="spellEnd"/>
+      <w:r>
+        <w:t>: Defensa de diagonal con bloqueo de línea</w:t>
+      </w:r>
+    </w:p>
+    <w:p>
+      <w:r>
+        <w:t xml:space="preserve">deporte: </w:t>
+      </w:r>
+      <w:proofErr w:type="spellStart"/>
+      <w:r>
+        <w:t>beach-volley</w:t>
+      </w:r>
+      <w:proofErr w:type="spellEnd"/>
+    </w:p>
+    <w:p>
+      <w:proofErr w:type="spellStart"/>
+      <w:r>
+        <w:t>categoria</w:t>
+      </w:r>
+      <w:proofErr w:type="spellEnd"/>
+      <w:r>
+        <w:t xml:space="preserve">: </w:t>
+      </w:r>
+      <w:proofErr w:type="spellStart"/>
+      <w:r>
+        <w:t>tactica</w:t>
+      </w:r>
+      <w:proofErr w:type="spellEnd"/>
+    </w:p>
+    <w:p>
+      <w:r>
+        <w:t>fase: defensa</w:t>
+      </w:r>
+    </w:p>
+    <w:p>
+      <w:r>
+        <w:t xml:space="preserve">autor: Pablo </w:t>
+      </w:r>
+      <w:proofErr w:type="spellStart"/>
+      <w:r>
+        <w:t>Churin</w:t>
+      </w:r>
+      <w:proofErr w:type="spellEnd"/>
+    </w:p>
+    <w:p>
+      <w:r>
+        <w:t>estado: validada</w:t>
+      </w:r>
+    </w:p>
+    <w:p>
+      <w:r>
+        <w:t>fecha: 2026-07-14</w:t>
+      </w:r>
+    </w:p>
+    <w:p>
+      <w:r>
+        <w:t>---</w:t>
+      </w:r>
+    </w:p>
+    <w:p/>
+    <w:p>
+      <w:r>
+        <w:t># Principio</w:t>
+      </w:r>
+    </w:p>
+    <w:p/>
+    <w:p>
+      <w:r>
+        <w:t>Cuando el bloqueo elimina la línea, la defensora debe priorizar la diagonal,</w:t>
+      </w:r>
+    </w:p>
+    <w:p>
+      <w:r>
+        <w:t>pero sin abandonar completamente el centro de la cancha.</w:t>
+      </w:r>
+    </w:p>
+    <w:p/>
+    <w:p>
+      <w:r>
+        <w:t># Indicadores observables</w:t>
+      </w:r>
+    </w:p>
+    <w:p/>
+    <w:p>
+      <w:r>
+        <w:t>- Orientación del bloqueo.</w:t>
+      </w:r>
+    </w:p>
+    <w:p>
+      <w:r>
+        <w:t>- Posición corporal del atacante.</w:t>
+      </w:r>
+    </w:p>
+    <w:p>
+      <w:r>
+        <w:t>- Calidad de la recepción rival.</w:t>
+      </w:r>
+    </w:p>
+    <w:p>
+      <w:r>
+        <w:t>- Influencia del viento.</w:t>
+      </w:r>
+    </w:p>
+    <w:p/>
+    <w:p>
+      <w:r>
+        <w:t># Error frecuente</w:t>
+      </w:r>
+    </w:p>
+    <w:p/>
+    <w:p>
+      <w:r>
+        <w:t>Retroceder demasiado pronto y dejar libre el espacio corto.</w:t>
+      </w:r>
+    </w:p>
+    <w:p/>
+    <w:p>
+      <w:r>
+        <w:t># Aplicación práctica</w:t>
+      </w:r>
+    </w:p>
+    <w:p/>
+    <w:p>
+      <w:r>
+        <w:t>Trabajar ejercicios donde la defensora espere la información del armado</w:t>
+      </w:r>
+    </w:p>
+    <w:p>
+      <w:r>
+        <w:lastRenderedPageBreak/>
+        <w:t>y del hombro atacante antes de completar su desplazamiento.</w:t>
+      </w:r>
+    </w:p>
+    <w:p/>
+    <w:p>
+      <w:r>
+        <w:t># Fuente</w:t>
+      </w:r>
+    </w:p>
+    <w:p/>
+    <w:p>
+      <w:r>
+        <w:t>Audio del entrenador: entrevista 2026-07-14.</w:t>
+      </w:r>
+    </w:p>
+    <w:p>
+      <w:pPr>
+        <w:rPr>
+          <w:b/>
+          <w:bCs/>
+        </w:rPr>
+      </w:pPr>
+      <w:r>
+        <w:rPr>
+          <w:b/>
+          <w:bCs/>
+        </w:rPr>
+        <w:t>Dónde quedarían guardados</w:t>
+      </w:r>
+    </w:p>
+    <w:p>
+      <w:r>
+        <w:t>Una estructura sencilla podría ser:</w:t>
+      </w:r>
+    </w:p>
+    <w:p>
+      <w:proofErr w:type="spellStart"/>
+      <w:r>
+        <w:t>BeachLab</w:t>
+      </w:r>
+      <w:proofErr w:type="spellEnd"/>
+      <w:r>
+        <w:t>/</w:t>
+      </w:r>
+    </w:p>
+    <w:p>
+      <w:r>
+        <w:rPr>
+          <w:rFonts w:ascii="MS Gothic" w:eastAsia="MS Gothic" w:hAnsi="MS Gothic" w:cs="MS Gothic" w:hint="eastAsia"/>
+        </w:rPr>
+        <w:t>├</w:t>
+      </w:r>
+      <w:r>
+        <w:rPr>
+          <w:rFonts w:ascii="Calibri" w:hAnsi="Calibri" w:cs="Calibri"/>
+        </w:rPr>
+        <w:t>──</w:t>
+      </w:r>
+      <w:r>
+        <w:t xml:space="preserve"> </w:t>
+      </w:r>
+      <w:proofErr w:type="spellStart"/>
+      <w:r>
+        <w:t>knowledge</w:t>
+      </w:r>
+      <w:proofErr w:type="spellEnd"/>
+      <w:r>
+        <w:t>/</w:t>
+      </w:r>
+    </w:p>
+    <w:p>
+      <w:r>
+        <w:t xml:space="preserve">│   </w:t>
+      </w:r>
+      <w:r>
+        <w:rPr>
+          <w:rFonts w:ascii="MS Gothic" w:eastAsia="MS Gothic" w:hAnsi="MS Gothic" w:cs="MS Gothic" w:hint="eastAsia"/>
+        </w:rPr>
+        <w:t>├</w:t>
+      </w:r>
+      <w:r>
+        <w:rPr>
+          <w:rFonts w:ascii="Calibri" w:hAnsi="Calibri" w:cs="Calibri"/>
+        </w:rPr>
+        <w:t>──</w:t>
+      </w:r>
+      <w:r>
+        <w:t xml:space="preserve"> </w:t>
+      </w:r>
+      <w:proofErr w:type="spellStart"/>
+      <w:r>
+        <w:t>tactica</w:t>
+      </w:r>
+      <w:proofErr w:type="spellEnd"/>
+      <w:r>
+        <w:t>/</w:t>
+      </w:r>
+    </w:p>
+    <w:p>
+      <w:r>
+        <w:t xml:space="preserve">│   </w:t>
+      </w:r>
+      <w:r>
+        <w:rPr>
+          <w:rFonts w:ascii="MS Gothic" w:eastAsia="MS Gothic" w:hAnsi="MS Gothic" w:cs="MS Gothic" w:hint="eastAsia"/>
+        </w:rPr>
+        <w:t>├</w:t>
+      </w:r>
+      <w:r>
+        <w:rPr>
+          <w:rFonts w:ascii="Calibri" w:hAnsi="Calibri" w:cs="Calibri"/>
+        </w:rPr>
+        <w:t>──</w:t>
+      </w:r>
+      <w:r>
+        <w:t xml:space="preserve"> </w:t>
+      </w:r>
+      <w:proofErr w:type="spellStart"/>
+      <w:r>
+        <w:t>tecnica</w:t>
+      </w:r>
+      <w:proofErr w:type="spellEnd"/>
+      <w:r>
+        <w:t>/</w:t>
+      </w:r>
+    </w:p>
+    <w:p>
+      <w:r>
+        <w:t xml:space="preserve">│   </w:t>
+      </w:r>
+      <w:r>
+        <w:rPr>
+          <w:rFonts w:ascii="MS Gothic" w:eastAsia="MS Gothic" w:hAnsi="MS Gothic" w:cs="MS Gothic" w:hint="eastAsia"/>
+        </w:rPr>
+        <w:t>├</w:t>
+      </w:r>
+      <w:r>
+        <w:rPr>
+          <w:rFonts w:ascii="Calibri" w:hAnsi="Calibri" w:cs="Calibri"/>
+        </w:rPr>
+        <w:t>──</w:t>
+      </w:r>
+      <w:r>
+        <w:t xml:space="preserve"> entrenamiento/</w:t>
+      </w:r>
+    </w:p>
+    <w:p>
+      <w:r>
+        <w:t xml:space="preserve">│   </w:t>
+      </w:r>
+      <w:r>
+        <w:rPr>
+          <w:rFonts w:ascii="MS Gothic" w:eastAsia="MS Gothic" w:hAnsi="MS Gothic" w:cs="MS Gothic" w:hint="eastAsia"/>
+        </w:rPr>
+        <w:t>├</w:t>
+      </w:r>
+      <w:r>
+        <w:rPr>
+          <w:rFonts w:ascii="Calibri" w:hAnsi="Calibri" w:cs="Calibri"/>
+        </w:rPr>
+        <w:t>──</w:t>
+      </w:r>
+      <w:r>
+        <w:t xml:space="preserve"> mental/</w:t>
+      </w:r>
+    </w:p>
+    <w:p>
+      <w:r>
+        <w:t xml:space="preserve">│   └── </w:t>
+      </w:r>
+      <w:proofErr w:type="spellStart"/>
+      <w:r>
+        <w:t>scouting</w:t>
+      </w:r>
+      <w:proofErr w:type="spellEnd"/>
+      <w:r>
+        <w:t>/</w:t>
+      </w:r>
+    </w:p>
+    <w:p>
+      <w:r>
+        <w:t>│</w:t>
+      </w:r>
+    </w:p>
+    <w:p>
+      <w:r>
+        <w:rPr>
+          <w:rFonts w:ascii="MS Gothic" w:eastAsia="MS Gothic" w:hAnsi="MS Gothic" w:cs="MS Gothic" w:hint="eastAsia"/>
+        </w:rPr>
+        <w:t>├</w:t>
+      </w:r>
+      <w:r>
+        <w:rPr>
+          <w:rFonts w:ascii="Calibri" w:hAnsi="Calibri" w:cs="Calibri"/>
+        </w:rPr>
+        <w:t>──</w:t>
+      </w:r>
+      <w:r>
+        <w:t xml:space="preserve"> </w:t>
+      </w:r>
+      <w:proofErr w:type="spellStart"/>
+      <w:r>
+        <w:t>recordings</w:t>
+      </w:r>
+      <w:proofErr w:type="spellEnd"/>
+      <w:r>
+        <w:t>/</w:t>
+      </w:r>
+    </w:p>
+    <w:p>
+      <w:r>
+        <w:t xml:space="preserve">│   </w:t>
+      </w:r>
+      <w:r>
+        <w:rPr>
+          <w:rFonts w:ascii="MS Gothic" w:eastAsia="MS Gothic" w:hAnsi="MS Gothic" w:cs="MS Gothic" w:hint="eastAsia"/>
+        </w:rPr>
+        <w:t>├</w:t>
+      </w:r>
+      <w:r>
+        <w:rPr>
+          <w:rFonts w:ascii="Calibri" w:hAnsi="Calibri" w:cs="Calibri"/>
+        </w:rPr>
+        <w:t>──</w:t>
+      </w:r>
+      <w:r>
+        <w:t xml:space="preserve"> audio/</w:t>
+      </w:r>
+    </w:p>
+    <w:p>
+      <w:r>
+        <w:t xml:space="preserve">│   └── </w:t>
+      </w:r>
+      <w:proofErr w:type="spellStart"/>
+      <w:r>
+        <w:t>transcripts</w:t>
+      </w:r>
+      <w:proofErr w:type="spellEnd"/>
+      <w:r>
+        <w:t>/</w:t>
+      </w:r>
+    </w:p>
+    <w:p>
+      <w:r>
+        <w:t>│</w:t>
+      </w:r>
+    </w:p>
+    <w:p>
+      <w:r>
+        <w:t xml:space="preserve">└── </w:t>
+      </w:r>
+      <w:proofErr w:type="spellStart"/>
+      <w:r>
+        <w:t>src</w:t>
+      </w:r>
+      <w:proofErr w:type="spellEnd"/>
+      <w:r>
+        <w:t>/</w:t>
+      </w:r>
+    </w:p>
+    <w:p>
+      <w:r>
+        <w:t>Así conservaríamos tres niveles:</w:t>
+      </w:r>
+    </w:p>
+    <w:p>
+      <w:r>
+        <w:t>Audio original       → evidencia</w:t>
+      </w:r>
+    </w:p>
+    <w:p>
+      <w:r>
+        <w:t>Transcripción        → contenido completo</w:t>
+      </w:r>
+    </w:p>
+    <w:p>
+      <w:r>
+        <w:t>Ficha de conocimiento → conocimiento utilizable</w:t>
+      </w:r>
+    </w:p>
+    <w:p>
+      <w:r>
+        <w:t>Eso es importante porque la ficha resume y ordena, pero el audio original permite volver a escuchar el contexto si algo fue interpretado incorrectamente.</w:t>
+      </w:r>
+    </w:p>
+    <w:p>
+      <w:pPr>
+        <w:rPr>
+          <w:b/>
+          <w:bCs/>
+        </w:rPr>
+      </w:pPr>
+      <w:r>
+        <w:rPr>
+          <w:b/>
+          <w:bCs/>
+        </w:rPr>
+        <w:t>Qué haríamos con los audios que ya enviaste</w:t>
+      </w:r>
+    </w:p>
+    <w:p>
+      <w:r>
+        <w:t>La mejor opción es volver al chat donde los mandaste y recuperar:</w:t>
+      </w:r>
+    </w:p>
+    <w:p>
+      <w:pPr>
+        <w:numPr>
+          <w:ilvl w:val="0"/>
+          <w:numId w:val="4"/>
+        </w:numPr>
+      </w:pPr>
+      <w:r>
+        <w:t>el audio, si todavía aparece disponible;</w:t>
+      </w:r>
+    </w:p>
+    <w:p>
+      <w:pPr>
+        <w:numPr>
+          <w:ilvl w:val="0"/>
+          <w:numId w:val="4"/>
+        </w:numPr>
+      </w:pPr>
+      <w:r>
+        <w:t xml:space="preserve">la transcripción, si </w:t>
+      </w:r>
+      <w:proofErr w:type="spellStart"/>
+      <w:r>
+        <w:t>ChatGPT</w:t>
+      </w:r>
+      <w:proofErr w:type="spellEnd"/>
+      <w:r>
+        <w:t xml:space="preserve"> la generó;</w:t>
+      </w:r>
+    </w:p>
+    <w:p>
+      <w:pPr>
+        <w:numPr>
+          <w:ilvl w:val="0"/>
+          <w:numId w:val="4"/>
+        </w:numPr>
+      </w:pPr>
+      <w:r>
+        <w:t>cualquier resumen o respuesta que hayamos producido.</w:t>
+      </w:r>
+    </w:p>
+    <w:p>
+      <w:r>
+        <w:lastRenderedPageBreak/>
+        <w:t xml:space="preserve">Después lo incorporamos al repositorio de </w:t>
+      </w:r>
+      <w:proofErr w:type="spellStart"/>
+      <w:r>
+        <w:t>BeachLab</w:t>
+      </w:r>
+      <w:proofErr w:type="spellEnd"/>
+      <w:r>
+        <w:t xml:space="preserve"> y generamos las primeras fichas.</w:t>
+      </w:r>
+    </w:p>
+    <w:p>
+      <w:r>
+        <w:t xml:space="preserve">No deberíamos depender de que dentro de un mes yo pueda localizar espontáneamente cada concepto de esos audios. </w:t>
+      </w:r>
+      <w:r>
+        <w:rPr>
+          <w:b/>
+          <w:bCs/>
+        </w:rPr>
+        <w:t xml:space="preserve">El conocimiento importante debe salir del chat y quedar físicamente guardado en </w:t>
+      </w:r>
+      <w:proofErr w:type="spellStart"/>
+      <w:r>
+        <w:rPr>
+          <w:b/>
+          <w:bCs/>
+        </w:rPr>
+        <w:t>BeachLab</w:t>
+      </w:r>
+      <w:proofErr w:type="spellEnd"/>
+      <w:r>
+        <w:rPr>
+          <w:b/>
+          <w:bCs/>
+        </w:rPr>
+        <w:t>.</w:t>
+      </w:r>
+    </w:p>
+    <w:p>
+      <w:r>
+        <w:t>En una primera versión, el Editor puede funcionar sin una IA integrada compleja:</w:t>
+      </w:r>
+    </w:p>
+    <w:p>
+      <w:r>
+        <w:t>Pegás una transcripción</w:t>
+      </w:r>
+    </w:p>
+    <w:p>
+      <w:r>
+        <w:t xml:space="preserve">→ </w:t>
+      </w:r>
+      <w:proofErr w:type="spellStart"/>
+      <w:r>
+        <w:t>presionás</w:t>
+      </w:r>
+      <w:proofErr w:type="spellEnd"/>
+      <w:r>
+        <w:t xml:space="preserve"> “Analizar”</w:t>
+      </w:r>
+    </w:p>
+    <w:p>
+      <w:r>
+        <w:t>→ se envía a una IA</w:t>
+      </w:r>
+    </w:p>
+    <w:p>
+      <w:r>
+        <w:t>→ devuelve fichas propuestas</w:t>
+      </w:r>
+    </w:p>
+    <w:p>
+      <w:r>
+        <w:t xml:space="preserve">→ </w:t>
+      </w:r>
+      <w:proofErr w:type="spellStart"/>
+      <w:r>
+        <w:t>revisás</w:t>
+      </w:r>
+      <w:proofErr w:type="spellEnd"/>
+    </w:p>
+    <w:p>
+      <w:r>
+        <w:t xml:space="preserve">→ </w:t>
+      </w:r>
+      <w:proofErr w:type="spellStart"/>
+      <w:r>
+        <w:t>guardás</w:t>
+      </w:r>
+      <w:proofErr w:type="spellEnd"/>
+      <w:r>
+        <w:t xml:space="preserve"> como .</w:t>
+      </w:r>
+      <w:proofErr w:type="spellStart"/>
+      <w:r>
+        <w:t>md</w:t>
+      </w:r>
+      <w:proofErr w:type="spellEnd"/>
+    </w:p>
+    <w:p>
+      <w:r>
+        <w:t>Más adelante agregamos grabación directa, transcripción automática y procesamiento por lotes. La prioridad ahora sería construir el circuito mínimo que transforme una conversación o audio en conocimiento permanente.</w:t>
+      </w:r>
+    </w:p>
     <w:p/>
     <w:sectPr>
       <w:pgSz w:w="11906" w:h="16838"/>
@@ -6274,11 +7292,11 @@
 </file>
 
 <file path=word/numbering.xml><?xml version="1.0" encoding="utf-8"?>
-<w:numbering xmlns:wpc="http://schemas.microsoft.com/office/word/2010/wordprocessingCanvas" xmlns:cx="http://schemas.microsoft.com/office/drawing/2014/chartex" xmlns:cx1="http://schemas.microsoft.com/office/drawing/2015/9/8/chartex" xmlns:cx2="http://schemas.microsoft.com/office/drawing/2015/10/21/chartex" xmlns:cx3="http://schemas.microsoft.com/office/drawing/2016/5/9/chartex" xmlns:cx4="http://schemas.microsoft.com/office/drawing/2016/5/10/chartex" xmlns:cx5="http://schemas.microsoft.com/office/drawing/2016/5/11/chartex" xmlns:cx6="http://schemas.microsoft.com/office/drawing/2016/5/12/chartex" xmlns:cx7="http://schemas.microsoft.com/office/drawing/2016/5/13/chartex" xmlns:cx8="http://schemas.microsoft.com/office/drawing/2016/5/14/chartex" xmlns:mc="http://schemas.openxmlformats.org/markup-compatibility/2006" xmlns:aink="http://schemas.microsoft.com/office/drawing/2016/ink" xmlns:am3d="http://schemas.microsoft.com/office/drawing/2017/model3d" xmlns:o="urn:schemas-microsoft-com:office:office" xmlns:r="http://schemas.openxmlformats.org/officeDocument/2006/relationships" xmlns:m="http://schemas.openxmlformats.org/officeDocument/2006/math" xmlns:v="urn:schemas-microsoft-com:vml" xmlns:wp14="http://schemas.microsoft.com/office/word/2010/wordprocessingDrawing" xmlns:wp="http://schemas.openxmlformats.org/drawingml/2006/wordprocessingDrawing" xmlns:w10="urn:schemas-microsoft-com:office:word" xmlns:w="http://schemas.openxmlformats.org/wordprocessingml/2006/main" xmlns:w14="http://schemas.microsoft.com/office/word/2010/wordml" xmlns:w15="http://schemas.microsoft.com/office/word/2012/wordml" xmlns:w16cex="http://schemas.microsoft.com/office/word/2018/wordml/cex" xmlns:w16cid="http://schemas.microsoft.com/office/word/2016/wordml/cid" xmlns:w16="http://schemas.microsoft.com/office/word/2018/wordml" xmlns:w16sdtdh="http://schemas.microsoft.com/office/word/2020/wordml/sdtdatahash" xmlns:w16se="http://schemas.microsoft.com/office/word/2015/wordml/symex" xmlns:wpg="http://schemas.microsoft.com/office/word/2010/wordprocessingGroup" xmlns:wpi="http://schemas.microsoft.com/office/word/2010/wordprocessingInk" xmlns:wne="http://schemas.microsoft.com/office/word/2006/wordml" xmlns:wps="http://schemas.microsoft.com/office/word/2010/wordprocessingShape" mc:Ignorable="w14 w15 w16se w16cid w16 w16cex w16sdtdh wp14">
+<w:numbering xmlns:wpc="http://schemas.microsoft.com/office/word/2010/wordprocessingCanvas" xmlns:cx="http://schemas.microsoft.com/office/drawing/2014/chartex" xmlns:cx1="http://schemas.microsoft.com/office/drawing/2015/9/8/chartex" xmlns:cx2="http://schemas.microsoft.com/office/drawing/2015/10/21/chartex" xmlns:cx3="http://schemas.microsoft.com/office/drawing/2016/5/9/chartex" xmlns:cx4="http://schemas.microsoft.com/office/drawing/2016/5/10/chartex" xmlns:cx5="http://schemas.microsoft.com/office/drawing/2016/5/11/chartex" xmlns:cx6="http://schemas.microsoft.com/office/drawing/2016/5/12/chartex" xmlns:cx7="http://schemas.microsoft.com/office/drawing/2016/5/13/chartex" xmlns:cx8="http://schemas.microsoft.com/office/drawing/2016/5/14/chartex" xmlns:mc="http://schemas.openxmlformats.org/markup-compatibility/2006" xmlns:aink="http://schemas.microsoft.com/office/drawing/2016/ink" xmlns:am3d="http://schemas.microsoft.com/office/drawing/2017/model3d" xmlns:o="urn:schemas-microsoft-com:office:office" xmlns:oel="http://schemas.microsoft.com/office/2019/extlst" xmlns:r="http://schemas.openxmlformats.org/officeDocument/2006/relationships" xmlns:m="http://schemas.openxmlformats.org/officeDocument/2006/math" xmlns:v="urn:schemas-microsoft-com:vml" xmlns:wp14="http://schemas.microsoft.com/office/word/2010/wordprocessingDrawing" xmlns:wp="http://schemas.openxmlformats.org/drawingml/2006/wordprocessingDrawing" xmlns:w10="urn:schemas-microsoft-com:office:word" xmlns:w="http://schemas.openxmlformats.org/wordprocessingml/2006/main" xmlns:w14="http://schemas.microsoft.com/office/word/2010/wordml" xmlns:w15="http://schemas.microsoft.com/office/word/2012/wordml" xmlns:w16cex="http://schemas.microsoft.com/office/word/2018/wordml/cex" xmlns:w16cid="http://schemas.microsoft.com/office/word/2016/wordml/cid" xmlns:w16="http://schemas.microsoft.com/office/word/2018/wordml" xmlns:w16du="http://schemas.microsoft.com/office/word/2023/wordml/word16du" xmlns:w16sdtdh="http://schemas.microsoft.com/office/word/2020/wordml/sdtdatahash" xmlns:w16se="http://schemas.microsoft.com/office/word/2015/wordml/symex" xmlns:wpg="http://schemas.microsoft.com/office/word/2010/wordprocessingGroup" xmlns:wpi="http://schemas.microsoft.com/office/word/2010/wordprocessingInk" xmlns:wne="http://schemas.microsoft.com/office/word/2006/wordml" xmlns:wps="http://schemas.microsoft.com/office/word/2010/wordprocessingShape" mc:Ignorable="w14 w15 w16se w16cid w16 w16cex w16sdtdh w16du wp14">
   <w:abstractNum w:abstractNumId="0" w15:restartNumberingAfterBreak="0">
-    <w:nsid w:val="3B8B079D"/>
+    <w:nsid w:val="20551860"/>
     <w:multiLevelType w:val="multilevel"/>
-    <w:tmpl w:val="7924B8A2"/>
+    <w:tmpl w:val="BE2C3F04"/>
     <w:lvl w:ilvl="0">
       <w:start w:val="1"/>
       <w:numFmt w:val="bullet"/>
@@ -6425,9 +7443,9 @@
     </w:lvl>
   </w:abstractNum>
   <w:abstractNum w:abstractNumId="1" w15:restartNumberingAfterBreak="0">
-    <w:nsid w:val="63550C58"/>
+    <w:nsid w:val="3B8B079D"/>
     <w:multiLevelType w:val="multilevel"/>
-    <w:tmpl w:val="69E056FA"/>
+    <w:tmpl w:val="7924B8A2"/>
     <w:lvl w:ilvl="0">
       <w:start w:val="1"/>
       <w:numFmt w:val="bullet"/>
@@ -6573,17 +7591,289 @@
       </w:rPr>
     </w:lvl>
   </w:abstractNum>
-  <w:num w:numId="1">
+  <w:abstractNum w:abstractNumId="2" w15:restartNumberingAfterBreak="0">
+    <w:nsid w:val="62B61E37"/>
+    <w:multiLevelType w:val="multilevel"/>
+    <w:tmpl w:val="9F921212"/>
+    <w:lvl w:ilvl="0">
+      <w:start w:val="1"/>
+      <w:numFmt w:val="decimal"/>
+      <w:lvlText w:val="%1."/>
+      <w:lvlJc w:val="left"/>
+      <w:pPr>
+        <w:tabs>
+          <w:tab w:val="num" w:pos="720"/>
+        </w:tabs>
+        <w:ind w:left="720" w:hanging="360"/>
+      </w:pPr>
+    </w:lvl>
+    <w:lvl w:ilvl="1">
+      <w:start w:val="1"/>
+      <w:numFmt w:val="bullet"/>
+      <w:lvlText w:val="o"/>
+      <w:lvlJc w:val="left"/>
+      <w:pPr>
+        <w:tabs>
+          <w:tab w:val="num" w:pos="1440"/>
+        </w:tabs>
+        <w:ind w:left="1440" w:hanging="360"/>
+      </w:pPr>
+      <w:rPr>
+        <w:rFonts w:ascii="Courier New" w:hAnsi="Courier New" w:hint="default"/>
+        <w:sz w:val="20"/>
+      </w:rPr>
+    </w:lvl>
+    <w:lvl w:ilvl="2" w:tentative="1">
+      <w:start w:val="1"/>
+      <w:numFmt w:val="decimal"/>
+      <w:lvlText w:val="%3."/>
+      <w:lvlJc w:val="left"/>
+      <w:pPr>
+        <w:tabs>
+          <w:tab w:val="num" w:pos="2160"/>
+        </w:tabs>
+        <w:ind w:left="2160" w:hanging="360"/>
+      </w:pPr>
+    </w:lvl>
+    <w:lvl w:ilvl="3" w:tentative="1">
+      <w:start w:val="1"/>
+      <w:numFmt w:val="decimal"/>
+      <w:lvlText w:val="%4."/>
+      <w:lvlJc w:val="left"/>
+      <w:pPr>
+        <w:tabs>
+          <w:tab w:val="num" w:pos="2880"/>
+        </w:tabs>
+        <w:ind w:left="2880" w:hanging="360"/>
+      </w:pPr>
+    </w:lvl>
+    <w:lvl w:ilvl="4" w:tentative="1">
+      <w:start w:val="1"/>
+      <w:numFmt w:val="decimal"/>
+      <w:lvlText w:val="%5."/>
+      <w:lvlJc w:val="left"/>
+      <w:pPr>
+        <w:tabs>
+          <w:tab w:val="num" w:pos="3600"/>
+        </w:tabs>
+        <w:ind w:left="3600" w:hanging="360"/>
+      </w:pPr>
+    </w:lvl>
+    <w:lvl w:ilvl="5" w:tentative="1">
+      <w:start w:val="1"/>
+      <w:numFmt w:val="decimal"/>
+      <w:lvlText w:val="%6."/>
+      <w:lvlJc w:val="left"/>
+      <w:pPr>
+        <w:tabs>
+          <w:tab w:val="num" w:pos="4320"/>
+        </w:tabs>
+        <w:ind w:left="4320" w:hanging="360"/>
+      </w:pPr>
+    </w:lvl>
+    <w:lvl w:ilvl="6" w:tentative="1">
+      <w:start w:val="1"/>
+      <w:numFmt w:val="decimal"/>
+      <w:lvlText w:val="%7."/>
+      <w:lvlJc w:val="left"/>
+      <w:pPr>
+        <w:tabs>
+          <w:tab w:val="num" w:pos="5040"/>
+        </w:tabs>
+        <w:ind w:left="5040" w:hanging="360"/>
+      </w:pPr>
+    </w:lvl>
+    <w:lvl w:ilvl="7" w:tentative="1">
+      <w:start w:val="1"/>
+      <w:numFmt w:val="decimal"/>
+      <w:lvlText w:val="%8."/>
+      <w:lvlJc w:val="left"/>
+      <w:pPr>
+        <w:tabs>
+          <w:tab w:val="num" w:pos="5760"/>
+        </w:tabs>
+        <w:ind w:left="5760" w:hanging="360"/>
+      </w:pPr>
+    </w:lvl>
+    <w:lvl w:ilvl="8" w:tentative="1">
+      <w:start w:val="1"/>
+      <w:numFmt w:val="decimal"/>
+      <w:lvlText w:val="%9."/>
+      <w:lvlJc w:val="left"/>
+      <w:pPr>
+        <w:tabs>
+          <w:tab w:val="num" w:pos="6480"/>
+        </w:tabs>
+        <w:ind w:left="6480" w:hanging="360"/>
+      </w:pPr>
+    </w:lvl>
+  </w:abstractNum>
+  <w:abstractNum w:abstractNumId="3" w15:restartNumberingAfterBreak="0">
+    <w:nsid w:val="63550C58"/>
+    <w:multiLevelType w:val="multilevel"/>
+    <w:tmpl w:val="69E056FA"/>
+    <w:lvl w:ilvl="0">
+      <w:start w:val="1"/>
+      <w:numFmt w:val="bullet"/>
+      <w:lvlText w:val=""/>
+      <w:lvlJc w:val="left"/>
+      <w:pPr>
+        <w:tabs>
+          <w:tab w:val="num" w:pos="720"/>
+        </w:tabs>
+        <w:ind w:left="720" w:hanging="360"/>
+      </w:pPr>
+      <w:rPr>
+        <w:rFonts w:ascii="Symbol" w:hAnsi="Symbol" w:hint="default"/>
+        <w:sz w:val="20"/>
+      </w:rPr>
+    </w:lvl>
+    <w:lvl w:ilvl="1" w:tentative="1">
+      <w:start w:val="1"/>
+      <w:numFmt w:val="bullet"/>
+      <w:lvlText w:val="o"/>
+      <w:lvlJc w:val="left"/>
+      <w:pPr>
+        <w:tabs>
+          <w:tab w:val="num" w:pos="1440"/>
+        </w:tabs>
+        <w:ind w:left="1440" w:hanging="360"/>
+      </w:pPr>
+      <w:rPr>
+        <w:rFonts w:ascii="Courier New" w:hAnsi="Courier New" w:hint="default"/>
+        <w:sz w:val="20"/>
+      </w:rPr>
+    </w:lvl>
+    <w:lvl w:ilvl="2" w:tentative="1">
+      <w:start w:val="1"/>
+      <w:numFmt w:val="bullet"/>
+      <w:lvlText w:val=""/>
+      <w:lvlJc w:val="left"/>
+      <w:pPr>
+        <w:tabs>
+          <w:tab w:val="num" w:pos="2160"/>
+        </w:tabs>
+        <w:ind w:left="2160" w:hanging="360"/>
+      </w:pPr>
+      <w:rPr>
+        <w:rFonts w:ascii="Wingdings" w:hAnsi="Wingdings" w:hint="default"/>
+        <w:sz w:val="20"/>
+      </w:rPr>
+    </w:lvl>
+    <w:lvl w:ilvl="3" w:tentative="1">
+      <w:start w:val="1"/>
+      <w:numFmt w:val="bullet"/>
+      <w:lvlText w:val=""/>
+      <w:lvlJc w:val="left"/>
+      <w:pPr>
+        <w:tabs>
+          <w:tab w:val="num" w:pos="2880"/>
+        </w:tabs>
+        <w:ind w:left="2880" w:hanging="360"/>
+      </w:pPr>
+      <w:rPr>
+        <w:rFonts w:ascii="Wingdings" w:hAnsi="Wingdings" w:hint="default"/>
+        <w:sz w:val="20"/>
+      </w:rPr>
+    </w:lvl>
+    <w:lvl w:ilvl="4" w:tentative="1">
+      <w:start w:val="1"/>
+      <w:numFmt w:val="bullet"/>
+      <w:lvlText w:val=""/>
+      <w:lvlJc w:val="left"/>
+      <w:pPr>
+        <w:tabs>
+          <w:tab w:val="num" w:pos="3600"/>
+        </w:tabs>
+        <w:ind w:left="3600" w:hanging="360"/>
+      </w:pPr>
+      <w:rPr>
+        <w:rFonts w:ascii="Wingdings" w:hAnsi="Wingdings" w:hint="default"/>
+        <w:sz w:val="20"/>
+      </w:rPr>
+    </w:lvl>
+    <w:lvl w:ilvl="5" w:tentative="1">
+      <w:start w:val="1"/>
+      <w:numFmt w:val="bullet"/>
+      <w:lvlText w:val=""/>
+      <w:lvlJc w:val="left"/>
+      <w:pPr>
+        <w:tabs>
+          <w:tab w:val="num" w:pos="4320"/>
+        </w:tabs>
+        <w:ind w:left="4320" w:hanging="360"/>
+      </w:pPr>
+      <w:rPr>
+        <w:rFonts w:ascii="Wingdings" w:hAnsi="Wingdings" w:hint="default"/>
+        <w:sz w:val="20"/>
+      </w:rPr>
+    </w:lvl>
+    <w:lvl w:ilvl="6" w:tentative="1">
+      <w:start w:val="1"/>
+      <w:numFmt w:val="bullet"/>
+      <w:lvlText w:val=""/>
+      <w:lvlJc w:val="left"/>
+      <w:pPr>
+        <w:tabs>
+          <w:tab w:val="num" w:pos="5040"/>
+        </w:tabs>
+        <w:ind w:left="5040" w:hanging="360"/>
+      </w:pPr>
+      <w:rPr>
+        <w:rFonts w:ascii="Wingdings" w:hAnsi="Wingdings" w:hint="default"/>
+        <w:sz w:val="20"/>
+      </w:rPr>
+    </w:lvl>
+    <w:lvl w:ilvl="7" w:tentative="1">
+      <w:start w:val="1"/>
+      <w:numFmt w:val="bullet"/>
+      <w:lvlText w:val=""/>
+      <w:lvlJc w:val="left"/>
+      <w:pPr>
+        <w:tabs>
+          <w:tab w:val="num" w:pos="5760"/>
+        </w:tabs>
+        <w:ind w:left="5760" w:hanging="360"/>
+      </w:pPr>
+      <w:rPr>
+        <w:rFonts w:ascii="Wingdings" w:hAnsi="Wingdings" w:hint="default"/>
+        <w:sz w:val="20"/>
+      </w:rPr>
+    </w:lvl>
+    <w:lvl w:ilvl="8" w:tentative="1">
+      <w:start w:val="1"/>
+      <w:numFmt w:val="bullet"/>
+      <w:lvlText w:val=""/>
+      <w:lvlJc w:val="left"/>
+      <w:pPr>
+        <w:tabs>
+          <w:tab w:val="num" w:pos="6480"/>
+        </w:tabs>
+        <w:ind w:left="6480" w:hanging="360"/>
+      </w:pPr>
+      <w:rPr>
+        <w:rFonts w:ascii="Wingdings" w:hAnsi="Wingdings" w:hint="default"/>
+        <w:sz w:val="20"/>
+      </w:rPr>
+    </w:lvl>
+  </w:abstractNum>
+  <w:num w:numId="1" w16cid:durableId="1052339876">
+    <w:abstractNumId w:val="1"/>
+  </w:num>
+  <w:num w:numId="2" w16cid:durableId="829638990">
+    <w:abstractNumId w:val="3"/>
+  </w:num>
+  <w:num w:numId="3" w16cid:durableId="1402947295">
+    <w:abstractNumId w:val="2"/>
+  </w:num>
+  <w:num w:numId="4" w16cid:durableId="1993169716">
     <w:abstractNumId w:val="0"/>
-  </w:num>
-  <w:num w:numId="2">
-    <w:abstractNumId w:val="1"/>
   </w:num>
 </w:numbering>
 </file>
 
 <file path=word/styles.xml><?xml version="1.0" encoding="utf-8"?>
-<w:styles xmlns:mc="http://schemas.openxmlformats.org/markup-compatibility/2006" xmlns:r="http://schemas.openxmlformats.org/officeDocument/2006/relationships" xmlns:w="http://schemas.openxmlformats.org/wordprocessingml/2006/main" xmlns:w14="http://schemas.microsoft.com/office/word/2010/wordml" xmlns:w15="http://schemas.microsoft.com/office/word/2012/wordml" xmlns:w16cex="http://schemas.microsoft.com/office/word/2018/wordml/cex" xmlns:w16cid="http://schemas.microsoft.com/office/word/2016/wordml/cid" xmlns:w16="http://schemas.microsoft.com/office/word/2018/wordml" xmlns:w16sdtdh="http://schemas.microsoft.com/office/word/2020/wordml/sdtdatahash" xmlns:w16se="http://schemas.microsoft.com/office/word/2015/wordml/symex" mc:Ignorable="w14 w15 w16se w16cid w16 w16cex w16sdtdh">
+<w:styles xmlns:mc="http://schemas.openxmlformats.org/markup-compatibility/2006" xmlns:r="http://schemas.openxmlformats.org/officeDocument/2006/relationships" xmlns:w="http://schemas.openxmlformats.org/wordprocessingml/2006/main" xmlns:w14="http://schemas.microsoft.com/office/word/2010/wordml" xmlns:w15="http://schemas.microsoft.com/office/word/2012/wordml" xmlns:w16cex="http://schemas.microsoft.com/office/word/2018/wordml/cex" xmlns:w16cid="http://schemas.microsoft.com/office/word/2016/wordml/cid" xmlns:w16="http://schemas.microsoft.com/office/word/2018/wordml" xmlns:w16du="http://schemas.microsoft.com/office/word/2023/wordml/word16du" xmlns:w16sdtdh="http://schemas.microsoft.com/office/word/2020/wordml/sdtdatahash" xmlns:w16se="http://schemas.microsoft.com/office/word/2015/wordml/symex" mc:Ignorable="w14 w15 w16se w16cid w16 w16cex w16sdtdh w16du">
   <w:docDefaults>
     <w:rPrDefault>
       <w:rPr>
@@ -7025,7 +8315,6 @@
   <w:style w:type="character" w:default="1" w:styleId="Fuentedeprrafopredeter">
     <w:name w:val="Default Paragraph Font"/>
     <w:uiPriority w:val="1"/>
-    <w:semiHidden/>
     <w:unhideWhenUsed/>
   </w:style>
   <w:style w:type="table" w:default="1" w:styleId="Tablanormal">
@@ -7169,6 +8458,29 @@
       <w:rFonts w:ascii="Courier New" w:eastAsia="Times New Roman" w:hAnsi="Courier New" w:cs="Courier New"/>
       <w:sz w:val="20"/>
       <w:szCs w:val="20"/>
+    </w:rPr>
+  </w:style>
+  <w:style w:type="character" w:styleId="Hipervnculo">
+    <w:name w:val="Hyperlink"/>
+    <w:basedOn w:val="Fuentedeprrafopredeter"/>
+    <w:uiPriority w:val="99"/>
+    <w:unhideWhenUsed/>
+    <w:rsid w:val="0096498D"/>
+    <w:rPr>
+      <w:color w:val="0563C1" w:themeColor="hyperlink"/>
+      <w:u w:val="single"/>
+    </w:rPr>
+  </w:style>
+  <w:style w:type="character" w:styleId="Mencinsinresolver">
+    <w:name w:val="Unresolved Mention"/>
+    <w:basedOn w:val="Fuentedeprrafopredeter"/>
+    <w:uiPriority w:val="99"/>
+    <w:semiHidden/>
+    <w:unhideWhenUsed/>
+    <w:rsid w:val="0096498D"/>
+    <w:rPr>
+      <w:color w:val="605E5C"/>
+      <w:shd w:val="clear" w:color="auto" w:fill="E1DFDD"/>
     </w:rPr>
   </w:style>
 </w:styles>

</xml_diff>